<commit_message>
small change to doc
</commit_message>
<xml_diff>
--- a/reports/Final_Report.docx
+++ b/reports/Final_Report.docx
@@ -68,7 +68,15 @@
     </w:p>
     <w:p>
       <w:r>
-        <w:t xml:space="preserve">I started the data wrangling process with </w:t>
+        <w:t xml:space="preserve">I started the data wrangling process </w:t>
+      </w:r>
+      <w:proofErr w:type="gramStart"/>
+      <w:r>
+        <w:t>with</w:t>
+      </w:r>
+      <w:proofErr w:type="gramEnd"/>
+      <w:r>
+        <w:t xml:space="preserve"> </w:t>
       </w:r>
       <w:r>
         <w:t>obtain</w:t>
@@ -77,17 +85,41 @@
         <w:t>ing</w:t>
       </w:r>
       <w:r>
-        <w:t xml:space="preserve"> the AI Jobs Dataset 2026 through KaggleHub. It loaded both an organized dataset and a raw postings file, then used the organized dataset for subsequent analysis. Its 22 variables included job title, employer characteristics, location, country, work arrangement, salary range, experience level, education, skills, specialization, and applicant count.</w:t>
-      </w:r>
-    </w:p>
-    <w:p>
-      <w:r>
-        <w:t>Initial checks found no missing values in the organized dataset and no exact duplicate rows. These checks established completeness at the table level, but did not establish that every field was accurate or that different rows represented distinct underlying vacancies. Unique URLs and collection timestamps can prevent otherwise similar postings from appearing as exact duplicates.</w:t>
-      </w:r>
-    </w:p>
-    <w:p>
-      <w:r>
-        <w:t>Three industry categories containing one posting each were excluded, leaving 51,929 rows. Company-size labels were standardized by combining two nearly equivalent descriptions of the 1,000–5,000 employee range. Education descriptions were also consolidated. In particular, the ambiguous requirement “Master's or PhD” was assigned to a master's category, a simplification that should be considered when interpreting education features.</w:t>
+        <w:t xml:space="preserve"> the AI Jobs Dataset 2026 through </w:t>
+      </w:r>
+      <w:proofErr w:type="spellStart"/>
+      <w:r>
+        <w:t>KaggleHub</w:t>
+      </w:r>
+      <w:proofErr w:type="spellEnd"/>
+      <w:r>
+        <w:t>. It loaded both an organized dataset and a raw postings file, then used the organized dataset for subsequent analysis. Its 22 variables included job title, employer characteristics, location, country, work arrangement, salary range, experience level, education, skills, specialization, and applicant count.</w:t>
+      </w:r>
+    </w:p>
+    <w:p>
+      <w:r>
+        <w:t xml:space="preserve">Initial checks found no missing values in the organized dataset and no exact duplicate rows. These checks established completeness at the table </w:t>
+      </w:r>
+      <w:proofErr w:type="gramStart"/>
+      <w:r>
+        <w:t>level, but</w:t>
+      </w:r>
+      <w:proofErr w:type="gramEnd"/>
+      <w:r>
+        <w:t xml:space="preserve"> did not establish that every field was accurate or that different rows represented distinct underlying vacancies. Unique URLs and collection timestamps can prevent otherwise similar postings from appearing as exact duplicates.</w:t>
+      </w:r>
+    </w:p>
+    <w:p>
+      <w:r>
+        <w:t>Three industry categories containing one posting each were excluded, leaving 51,929 rows. Company-size labels were standardized by combining two nearly equivalent descriptions of the 1,000–5,000 employee range. Education descriptions were also consolidated. In particular, the ambiguous requirement “</w:t>
+      </w:r>
+      <w:proofErr w:type="gramStart"/>
+      <w:r>
+        <w:t>Master's</w:t>
+      </w:r>
+      <w:proofErr w:type="gramEnd"/>
+      <w:r>
+        <w:t xml:space="preserve"> or PhD” was assigned to a master's category, a simplification that should be considered when interpreting education features.</w:t>
       </w:r>
     </w:p>
     <w:p/>
@@ -127,6 +159,9 @@
     </w:p>
     <w:p>
       <w:r>
+        <w:rPr>
+          <w:noProof/>
+        </w:rPr>
         <w:drawing>
           <wp:anchor distT="0" distB="0" distL="114300" distR="114300" simplePos="0" relativeHeight="251659264" behindDoc="0" locked="0" layoutInCell="1" allowOverlap="1" wp14:anchorId="6B82180A" wp14:editId="22A5E229">
             <wp:simplePos x="0" y="0"/>
@@ -186,11 +221,24 @@
       <w:r>
         <w:t xml:space="preserve">Machine Learning accounted for </w:t>
       </w:r>
-      <w:r>
-        <w:t xml:space="preserve">the majority of the postings with </w:t>
-      </w:r>
-      <w:r>
-        <w:t xml:space="preserve">3,245 postings, followed by MLOps with </w:t>
+      <w:proofErr w:type="gramStart"/>
+      <w:r>
+        <w:t>the majority of</w:t>
+      </w:r>
+      <w:proofErr w:type="gramEnd"/>
+      <w:r>
+        <w:t xml:space="preserve"> the postings with </w:t>
+      </w:r>
+      <w:r>
+        <w:t xml:space="preserve">3,245 postings, followed by </w:t>
+      </w:r>
+      <w:proofErr w:type="spellStart"/>
+      <w:r>
+        <w:t>MLOps</w:t>
+      </w:r>
+      <w:proofErr w:type="spellEnd"/>
+      <w:r>
+        <w:t xml:space="preserve"> with </w:t>
       </w:r>
       <w:r>
         <w:t>~1400</w:t>
@@ -375,6 +423,9 @@
     </w:p>
     <w:p>
       <w:r>
+        <w:rPr>
+          <w:noProof/>
+        </w:rPr>
         <w:drawing>
           <wp:inline distT="0" distB="0" distL="0" distR="0" wp14:anchorId="46559A9F" wp14:editId="7B43E76A">
             <wp:extent cx="5943600" cy="3172460"/>
@@ -414,7 +465,39 @@
     </w:p>
     <w:p>
       <w:r>
-        <w:t>The recorded skill-frequency analysis identified Pandas as the most common skill, appearing in approximately 46.0% of this subset. Several traditional machine-learning tools and methods appeared in approximately 39–40% of postings, including LightGBM, Scikit-learn, Random Forest, Regression, XGBoost, NumPy, Supervised Learning, and Feature Engineering. PyTorch appeared in approximately 22.1%, while several MLOps tools appeared in approximately 19%.</w:t>
+        <w:t xml:space="preserve">The recorded skill-frequency analysis identified Pandas as the most common skill, appearing in approximately 46.0% of this subset. Several traditional machine-learning tools and methods appeared in approximately 39–40% of postings, including </w:t>
+      </w:r>
+      <w:proofErr w:type="spellStart"/>
+      <w:r>
+        <w:t>LightGBM</w:t>
+      </w:r>
+      <w:proofErr w:type="spellEnd"/>
+      <w:r>
+        <w:t xml:space="preserve">, Scikit-learn, Random Forest, Regression, </w:t>
+      </w:r>
+      <w:proofErr w:type="spellStart"/>
+      <w:r>
+        <w:t>XGBoost</w:t>
+      </w:r>
+      <w:proofErr w:type="spellEnd"/>
+      <w:r>
+        <w:t xml:space="preserve">, NumPy, Supervised Learning, and Feature Engineering. </w:t>
+      </w:r>
+      <w:proofErr w:type="spellStart"/>
+      <w:r>
+        <w:t>PyTorch</w:t>
+      </w:r>
+      <w:proofErr w:type="spellEnd"/>
+      <w:r>
+        <w:t xml:space="preserve"> appeared in approximately 22.1%, while several </w:t>
+      </w:r>
+      <w:proofErr w:type="spellStart"/>
+      <w:r>
+        <w:t>MLOps</w:t>
+      </w:r>
+      <w:proofErr w:type="spellEnd"/>
+      <w:r>
+        <w:t xml:space="preserve"> tools appeared in approximately 19%.</w:t>
       </w:r>
     </w:p>
     <w:p>
@@ -488,7 +571,15 @@
               <w:cnfStyle w:val="000000000000" w:firstRow="0" w:lastRow="0" w:firstColumn="0" w:lastColumn="0" w:oddVBand="0" w:evenVBand="0" w:oddHBand="0" w:evenHBand="0" w:firstRowFirstColumn="0" w:firstRowLastColumn="0" w:lastRowFirstColumn="0" w:lastRowLastColumn="0"/>
             </w:pPr>
             <w:r>
-              <w:t>OCR, ResNet, OpenCV, YOLO, image processing</w:t>
+              <w:t xml:space="preserve">OCR, </w:t>
+            </w:r>
+            <w:proofErr w:type="spellStart"/>
+            <w:r>
+              <w:t>ResNet</w:t>
+            </w:r>
+            <w:proofErr w:type="spellEnd"/>
+            <w:r>
+              <w:t>, OpenCV, YOLO, image processing</w:t>
             </w:r>
           </w:p>
         </w:tc>
@@ -514,7 +605,15 @@
               <w:cnfStyle w:val="000000000000" w:firstRow="0" w:lastRow="0" w:firstColumn="0" w:lastColumn="0" w:oddVBand="0" w:evenVBand="0" w:oddHBand="0" w:evenHBand="0" w:firstRowFirstColumn="0" w:firstRowLastColumn="0" w:lastRowFirstColumn="0" w:lastRowLastColumn="0"/>
             </w:pPr>
             <w:r>
-              <w:t>Matplotlib, Statsmodels, SQL, A/B testing, data visualization</w:t>
+              <w:t xml:space="preserve">Matplotlib, </w:t>
+            </w:r>
+            <w:proofErr w:type="spellStart"/>
+            <w:r>
+              <w:t>Statsmodels</w:t>
+            </w:r>
+            <w:proofErr w:type="spellEnd"/>
+            <w:r>
+              <w:t>, SQL, A/B testing, data visualization</w:t>
             </w:r>
           </w:p>
         </w:tc>
@@ -540,8 +639,13 @@
               <w:cnfStyle w:val="000000000000" w:firstRow="0" w:lastRow="0" w:firstColumn="0" w:lastColumn="0" w:oddVBand="0" w:evenVBand="0" w:oddHBand="0" w:evenHBand="0" w:firstRowFirstColumn="0" w:firstRowLastColumn="0" w:lastRowFirstColumn="0" w:lastRowLastColumn="0"/>
             </w:pPr>
             <w:r>
-              <w:t>Backpropagation, CNNs, CUDA, neural networks, Keras</w:t>
-            </w:r>
+              <w:t xml:space="preserve">Backpropagation, CNNs, CUDA, neural networks, </w:t>
+            </w:r>
+            <w:proofErr w:type="spellStart"/>
+            <w:r>
+              <w:t>Keras</w:t>
+            </w:r>
+            <w:proofErr w:type="spellEnd"/>
           </w:p>
         </w:tc>
       </w:tr>
@@ -578,9 +682,11 @@
             <w:tcW w:w="2155" w:type="dxa"/>
           </w:tcPr>
           <w:p>
+            <w:proofErr w:type="spellStart"/>
             <w:r>
               <w:t>MLOps</w:t>
             </w:r>
+            <w:proofErr w:type="spellEnd"/>
           </w:p>
         </w:tc>
         <w:tc>
@@ -618,7 +724,15 @@
               <w:cnfStyle w:val="000000000000" w:firstRow="0" w:lastRow="0" w:firstColumn="0" w:lastColumn="0" w:oddVBand="0" w:evenVBand="0" w:oddHBand="0" w:evenHBand="0" w:firstRowFirstColumn="0" w:firstRowLastColumn="0" w:lastRowFirstColumn="0" w:lastRowLastColumn="0"/>
             </w:pPr>
             <w:r>
-              <w:t>Feature engineering, supervised learning, NumPy, XGBoost, regression</w:t>
+              <w:t xml:space="preserve">Feature engineering, supervised learning, NumPy, </w:t>
+            </w:r>
+            <w:proofErr w:type="spellStart"/>
+            <w:r>
+              <w:t>XGBoost</w:t>
+            </w:r>
+            <w:proofErr w:type="spellEnd"/>
+            <w:r>
+              <w:t>, regression</w:t>
             </w:r>
           </w:p>
         </w:tc>
@@ -644,7 +758,15 @@
               <w:cnfStyle w:val="000000000000" w:firstRow="0" w:lastRow="0" w:firstColumn="0" w:lastColumn="0" w:oddVBand="0" w:evenVBand="0" w:oddHBand="0" w:evenHBand="0" w:firstRowFirstColumn="0" w:firstRowLastColumn="0" w:lastRowFirstColumn="0" w:lastRowLastColumn="0"/>
             </w:pPr>
             <w:r>
-              <w:t>GPT, BERT, spaCy, tokenization, Transformers</w:t>
+              <w:t xml:space="preserve">GPT, BERT, </w:t>
+            </w:r>
+            <w:proofErr w:type="spellStart"/>
+            <w:r>
+              <w:t>spaCy</w:t>
+            </w:r>
+            <w:proofErr w:type="spellEnd"/>
+            <w:r>
+              <w:t>, tokenization, Transformers</w:t>
             </w:r>
           </w:p>
         </w:tc>
@@ -680,6 +802,9 @@
     </w:p>
     <w:p>
       <w:r>
+        <w:rPr>
+          <w:noProof/>
+        </w:rPr>
         <w:drawing>
           <wp:anchor distT="0" distB="0" distL="114300" distR="114300" simplePos="0" relativeHeight="251660288" behindDoc="0" locked="0" layoutInCell="1" allowOverlap="1" wp14:anchorId="47C24322" wp14:editId="7A932755">
             <wp:simplePos x="0" y="0"/>
@@ -760,7 +885,23 @@
     </w:p>
     <w:p>
       <w:r>
-        <w:t xml:space="preserve">I chose to work with a Linear Regression model asit provided an interpretable starting point. I also worked with a Random Forest to try a different model that wasn’t related to linear regression while wanting to see if I could find any nonlinear relationships and interactions by averaging predictions from multiple decision trees. </w:t>
+        <w:t xml:space="preserve">I chose to work with a Linear Regression model </w:t>
+      </w:r>
+      <w:proofErr w:type="spellStart"/>
+      <w:r>
+        <w:t>asit</w:t>
+      </w:r>
+      <w:proofErr w:type="spellEnd"/>
+      <w:r>
+        <w:t xml:space="preserve"> provided an interpretable starting point. I also worked with </w:t>
+      </w:r>
+      <w:proofErr w:type="gramStart"/>
+      <w:r>
+        <w:t>a Random</w:t>
+      </w:r>
+      <w:proofErr w:type="gramEnd"/>
+      <w:r>
+        <w:t xml:space="preserve"> Forest to try a different model that wasn’t related to linear regression while wanting to see if I could find any nonlinear relationships and interactions by averaging predictions from multiple decision trees. </w:t>
       </w:r>
     </w:p>
     <w:p>
@@ -779,7 +920,15 @@
     </w:p>
     <w:p>
       <w:r>
-        <w:t>These feature choices defined the information available to the models. Hyperparameters, in contrast, controlled how each model learned from that information. For example, the number of selected skills was fixed during preprocessing, while tree depth was varied during Random Forest tuning. No additional scaling step was included in the model search. Linear Regression used 20 predictors after removing two reference-category indicators; Random Forest retained all 22.</w:t>
+        <w:t xml:space="preserve">These feature choices </w:t>
+      </w:r>
+      <w:proofErr w:type="gramStart"/>
+      <w:r>
+        <w:t>defined</w:t>
+      </w:r>
+      <w:proofErr w:type="gramEnd"/>
+      <w:r>
+        <w:t xml:space="preserve"> the information available to the models. Hyperparameters, in contrast, controlled how each model learned from that information. For example, the number of selected skills was fixed during preprocessing, while tree depth was varied during Random Forest tuning. No additional scaling step was included in the model search. Linear Regression used 20 predictors after removing two reference-category indicators; Random Forest retained all 22.</w:t>
       </w:r>
     </w:p>
     <w:p>
@@ -798,14 +947,24 @@
     </w:p>
     <w:p>
       <w:r>
-        <w:t>Mean absolute error (MAE) was the primary evaluation metric because it expresses the average absolute prediction error in salary units. Root mean squared error (RMSE) provided a measure that gives greater weight to large errors. R² measured performance relative to variation in the test targets. A mean-predicting DummyRegressor provided a simple reference for assessing whether the job features improved prediction.</w:t>
-      </w:r>
-    </w:p>
+        <w:t xml:space="preserve">Mean absolute error (MAE) was the primary evaluation metric because it expresses the average absolute prediction error in salary units. Root </w:t>
+      </w:r>
+      <w:proofErr w:type="gramStart"/>
+      <w:r>
+        <w:t>mean</w:t>
+      </w:r>
+      <w:proofErr w:type="gramEnd"/>
+      <w:r>
+        <w:t xml:space="preserve"> squared error (RMSE) provided a measure that gives greater weight to large errors. R² measured performance relative to variation in the test targets. A mean-predicting DummyRegressor provided a simple reference for assessing whether the job features improved prediction.</w:t>
+      </w:r>
+    </w:p>
+    <w:p/>
     <w:p>
       <w:pPr>
         <w:pStyle w:val="Heading2"/>
       </w:pPr>
       <w:r>
+        <w:lastRenderedPageBreak/>
         <w:t>Modeling</w:t>
       </w:r>
     </w:p>
@@ -816,13 +975,20 @@
           <w:b/>
           <w:bCs/>
         </w:rPr>
-        <w:lastRenderedPageBreak/>
         <w:t>Linear Regression</w:t>
       </w:r>
     </w:p>
     <w:p>
       <w:r>
-        <w:t>Linear Regression provided an interpretable starting point. Bachelor's education and entry-level experience were omitted as reference categories, leaving 20 predictors. The same predictor columns were used for all four configurations. The search varied two settings:</w:t>
+        <w:t xml:space="preserve">Linear Regression provided an interpretable starting point. Bachelor's education and entry-level experience were omitted as reference categories, leaving 20 predictors. The same predictor columns were used for all four configurations. The search </w:t>
+      </w:r>
+      <w:proofErr w:type="gramStart"/>
+      <w:r>
+        <w:t>varied</w:t>
+      </w:r>
+      <w:proofErr w:type="gramEnd"/>
+      <w:r>
+        <w:t xml:space="preserve"> two settings:</w:t>
       </w:r>
     </w:p>
     <w:tbl>
@@ -905,9 +1071,11 @@
             <w:tcW w:w="2142" w:type="dxa"/>
           </w:tcPr>
           <w:p>
+            <w:proofErr w:type="spellStart"/>
             <w:r>
               <w:t>fit_intercept</w:t>
             </w:r>
+            <w:proofErr w:type="spellEnd"/>
           </w:p>
         </w:tc>
         <w:tc>
@@ -1006,12 +1174,36 @@
     <w:p/>
     <w:p>
       <w:r>
-        <w:t>Keeping an intercept allowed the model to represent a starting salary for the reference categories. Turning it off imposed a different constraint on the same feature matrix, and those configurations performed worse in validation. Allowing either sign for coefficients represented the original unconstrained model; restricting them to nonnegative values tested whether a simpler set of permitted relationships improved validation performance. This restriction does not guarantee positive salary predictions or establish that every feature increases salary.</w:t>
-      </w:r>
-    </w:p>
-    <w:p>
-      <w:r>
-        <w:t>The selected configuration was fit_intercept=True and positive=True. Its mean cross-validation MAE was $9,735.49, with a fold standard deviation of $157.62, compared with $9,756.88 for the original settings (fit_intercept=True, positive=False). Tuning therefore reduced validation MAE by only $21.39, approximately 0.22%. This improvement was small relative to the variation between folds. The selected model's mean training-fold MAE was $9,719.57, close to its validation MAE, providing little indication of a large training-to-validation performance gap under this evaluation.</w:t>
+        <w:t xml:space="preserve">Keeping an intercept allowed the model to represent a starting salary for the reference categories. Turning it off imposed a different constraint on the same feature matrix, and those configurations performed worse in validation. Allowing either sign for coefficients represented the original unconstrained model; restricting them to nonnegative values tested whether a simpler set of permitted relationships improved validation performance. This restriction does not guarantee positive salary predictions or establish that every feature </w:t>
+      </w:r>
+      <w:proofErr w:type="gramStart"/>
+      <w:r>
+        <w:t>increases</w:t>
+      </w:r>
+      <w:proofErr w:type="gramEnd"/>
+      <w:r>
+        <w:t xml:space="preserve"> salary.</w:t>
+      </w:r>
+    </w:p>
+    <w:p>
+      <w:r>
+        <w:t>The selected configuration was </w:t>
+      </w:r>
+      <w:proofErr w:type="spellStart"/>
+      <w:r>
+        <w:t>fit_intercept</w:t>
+      </w:r>
+      <w:proofErr w:type="spellEnd"/>
+      <w:r>
+        <w:t>=True and positive=True. Its mean cross-validation MAE was $9,735.49, with a fold standard deviation of $157.62, compared with $9,756.88 for the original settings (</w:t>
+      </w:r>
+      <w:proofErr w:type="spellStart"/>
+      <w:r>
+        <w:t>fit_intercept</w:t>
+      </w:r>
+      <w:proofErr w:type="spellEnd"/>
+      <w:r>
+        <w:t>=True, positive=False). Tuning therefore reduced validation MAE by only $21.39, approximately 0.22%. This improvement was small relative to the variation between folds. The selected model's mean training-fold MAE was $9,719.57, close to its validation MAE, providing little indication of a large training-to-validation performance gap under this evaluation.</w:t>
       </w:r>
     </w:p>
     <w:p>
@@ -1025,6 +1217,7 @@
     </w:p>
     <w:p>
       <w:r>
+        <w:lastRenderedPageBreak/>
         <w:t>Random Forest was used to capture nonlinear relationships and interactions by averaging predictions from multiple decision trees. Its search varied three hyperparameters, each with two candidate values, producing eight combinations:</w:t>
       </w:r>
     </w:p>
@@ -1055,7 +1248,6 @@
               <w:rPr>
                 <w:color w:val="auto"/>
               </w:rPr>
-              <w:lastRenderedPageBreak/>
               <w:t>Hyperparameter</w:t>
             </w:r>
           </w:p>
@@ -1110,9 +1302,11 @@
             <w:tcW w:w="2337" w:type="dxa"/>
           </w:tcPr>
           <w:p>
+            <w:proofErr w:type="spellStart"/>
             <w:r>
               <w:t>max_depth</w:t>
             </w:r>
+            <w:proofErr w:type="spellEnd"/>
           </w:p>
         </w:tc>
         <w:tc>
@@ -1162,9 +1356,11 @@
             <w:tcW w:w="2337" w:type="dxa"/>
           </w:tcPr>
           <w:p>
+            <w:proofErr w:type="spellStart"/>
             <w:r>
               <w:t>min_samples_text</w:t>
             </w:r>
+            <w:proofErr w:type="spellEnd"/>
           </w:p>
         </w:tc>
         <w:tc>
@@ -1217,9 +1413,11 @@
             <w:tcW w:w="2337" w:type="dxa"/>
           </w:tcPr>
           <w:p>
+            <w:proofErr w:type="spellStart"/>
             <w:r>
               <w:t>max_features</w:t>
             </w:r>
+            <w:proofErr w:type="spellEnd"/>
           </w:p>
         </w:tc>
         <w:tc>
@@ -1244,7 +1442,15 @@
               <w:cnfStyle w:val="000000100000" w:firstRow="0" w:lastRow="0" w:firstColumn="0" w:lastColumn="0" w:oddVBand="0" w:evenVBand="0" w:oddHBand="1" w:evenHBand="0" w:firstRowFirstColumn="0" w:firstRowLastColumn="0" w:lastRowFirstColumn="0" w:lastRowLastColumn="0"/>
             </w:pPr>
             <w:r>
-              <w:t>Fraction of predictors considered when searching for a split. The candidates correspond to half or all of the 22 features.</w:t>
+              <w:t xml:space="preserve">Fraction of predictors considered when searching for a split. The candidates correspond to half or </w:t>
+            </w:r>
+            <w:proofErr w:type="gramStart"/>
+            <w:r>
+              <w:t>all of</w:t>
+            </w:r>
+            <w:proofErr w:type="gramEnd"/>
+            <w:r>
+              <w:t xml:space="preserve"> the 22 features.</w:t>
             </w:r>
           </w:p>
         </w:tc>
@@ -1269,9 +1475,11 @@
             <w:tcW w:w="2337" w:type="dxa"/>
           </w:tcPr>
           <w:p>
+            <w:proofErr w:type="spellStart"/>
             <w:r>
               <w:t>n_estimators</w:t>
             </w:r>
+            <w:proofErr w:type="spellEnd"/>
           </w:p>
         </w:tc>
         <w:tc>
@@ -1315,20 +1523,291 @@
         </w:tc>
       </w:tr>
     </w:tbl>
-    <w:p/>
-    <w:p>
-      <w:r>
-        <w:t>The tree count was a fixed hyperparameter, so the experiment did not establish that 150 trees was optimal. The forest also used random_state=42 for repeatable random sampling. Limiting depth and increasing leaf size restricted how closely individual trees could fit local details. Considering only half the predictors at each split introduced more variation among trees, which can reduce their tendency to make similar errors.</w:t>
-      </w:r>
-    </w:p>
-    <w:p>
-      <w:r>
-        <w:t>The selected configuration used max_depth=8, min_samples_leaf=5, and max_features=0.5. Its mean cross-validation MAE was $9,559.79, with a standard deviation of $110.46. Its mean training-fold MAE was $9,258.59, giving a training-to-validation gap of about $301. In contrast, forests with no depth limit and one-sample minimum leaves had training MAEs of approximately $8,100 but validation MAEs of approximately $10,100. Their closer fit to training rows did not translate into better validation predictions.</w:t>
-      </w:r>
-    </w:p>
-    <w:p>
-      <w:r>
-        <w:br w:type="page"/>
+    <w:p>
+      <w:r>
+        <w:t xml:space="preserve">The tree count was a fixed hyperparameter, so the experiment did not establish that 150 trees </w:t>
+      </w:r>
+      <w:proofErr w:type="gramStart"/>
+      <w:r>
+        <w:t>was</w:t>
+      </w:r>
+      <w:proofErr w:type="gramEnd"/>
+      <w:r>
+        <w:t xml:space="preserve"> optimal. The forest also used </w:t>
+      </w:r>
+      <w:proofErr w:type="spellStart"/>
+      <w:r>
+        <w:t>random_state</w:t>
+      </w:r>
+      <w:proofErr w:type="spellEnd"/>
+      <w:r>
+        <w:t>=42 for repeatable random sampling. Limiting depth and increasing leaf size restricted how closely individual trees could fit local details. Considering only half the predictors at each split introduced more variation among trees, which can reduce their tendency to make similar errors.</w:t>
+      </w:r>
+    </w:p>
+    <w:p>
+      <w:r>
+        <w:t>The selected configuration used </w:t>
+      </w:r>
+      <w:proofErr w:type="spellStart"/>
+      <w:r>
+        <w:t>max_depth</w:t>
+      </w:r>
+      <w:proofErr w:type="spellEnd"/>
+      <w:r>
+        <w:t>=8, </w:t>
+      </w:r>
+      <w:proofErr w:type="spellStart"/>
+      <w:r>
+        <w:t>min_samples_leaf</w:t>
+      </w:r>
+      <w:proofErr w:type="spellEnd"/>
+      <w:r>
+        <w:t>=5, and </w:t>
+      </w:r>
+      <w:proofErr w:type="spellStart"/>
+      <w:r>
+        <w:t>max_features</w:t>
+      </w:r>
+      <w:proofErr w:type="spellEnd"/>
+      <w:r>
+        <w:t>=0.5. Its mean cross-validation MAE was $9,559.79, with a standard deviation of $110.46. Its mean training-fold MAE was $9,258.59, giving a training-to-validation gap of about $301. In contrast, forests with no depth limit and one-sample minimum leaves had training MAEs of approximately $8,100 but validation MAEs of approximately $10,100. Their closer fit to training rows did not translate into better validation predictions.</w:t>
+      </w:r>
+    </w:p>
+    <w:tbl>
+      <w:tblPr>
+        <w:tblStyle w:val="GridTable4"/>
+        <w:tblW w:w="9445" w:type="dxa"/>
+        <w:tblLook w:val="04A0" w:firstRow="1" w:lastRow="0" w:firstColumn="1" w:lastColumn="0" w:noHBand="0" w:noVBand="1"/>
+      </w:tblPr>
+      <w:tblGrid>
+        <w:gridCol w:w="4675"/>
+        <w:gridCol w:w="2250"/>
+        <w:gridCol w:w="2520"/>
+      </w:tblGrid>
+      <w:tr>
+        <w:trPr>
+          <w:cnfStyle w:val="100000000000" w:firstRow="1" w:lastRow="0" w:firstColumn="0" w:lastColumn="0" w:oddVBand="0" w:evenVBand="0" w:oddHBand="0" w:evenHBand="0" w:firstRowFirstColumn="0" w:firstRowLastColumn="0" w:lastRowFirstColumn="0" w:lastRowLastColumn="0"/>
+        </w:trPr>
+        <w:tc>
+          <w:tcPr>
+            <w:cnfStyle w:val="001000000000" w:firstRow="0" w:lastRow="0" w:firstColumn="1" w:lastColumn="0" w:oddVBand="0" w:evenVBand="0" w:oddHBand="0" w:evenHBand="0" w:firstRowFirstColumn="0" w:firstRowLastColumn="0" w:lastRowFirstColumn="0" w:lastRowLastColumn="0"/>
+            <w:tcW w:w="4675" w:type="dxa"/>
+          </w:tcPr>
+          <w:p>
+            <w:r>
+              <w:t>Configuration</w:t>
+            </w:r>
+          </w:p>
+        </w:tc>
+        <w:tc>
+          <w:tcPr>
+            <w:tcW w:w="2250" w:type="dxa"/>
+          </w:tcPr>
+          <w:p>
+            <w:pPr>
+              <w:cnfStyle w:val="100000000000" w:firstRow="1" w:lastRow="0" w:firstColumn="0" w:lastColumn="0" w:oddVBand="0" w:evenVBand="0" w:oddHBand="0" w:evenHBand="0" w:firstRowFirstColumn="0" w:firstRowLastColumn="0" w:lastRowFirstColumn="0" w:lastRowLastColumn="0"/>
+            </w:pPr>
+            <w:r>
+              <w:t>Mean training MAE</w:t>
+            </w:r>
+          </w:p>
+        </w:tc>
+        <w:tc>
+          <w:tcPr>
+            <w:tcW w:w="2520" w:type="dxa"/>
+          </w:tcPr>
+          <w:p>
+            <w:pPr>
+              <w:cnfStyle w:val="100000000000" w:firstRow="1" w:lastRow="0" w:firstColumn="0" w:lastColumn="0" w:oddVBand="0" w:evenVBand="0" w:oddHBand="0" w:evenHBand="0" w:firstRowFirstColumn="0" w:firstRowLastColumn="0" w:lastRowFirstColumn="0" w:lastRowLastColumn="0"/>
+            </w:pPr>
+            <w:r>
+              <w:t xml:space="preserve">Mean </w:t>
+            </w:r>
+            <w:r>
+              <w:t>validation</w:t>
+            </w:r>
+            <w:r>
+              <w:t xml:space="preserve"> MAE</w:t>
+            </w:r>
+          </w:p>
+        </w:tc>
+      </w:tr>
+      <w:tr>
+        <w:trPr>
+          <w:cnfStyle w:val="000000100000" w:firstRow="0" w:lastRow="0" w:firstColumn="0" w:lastColumn="0" w:oddVBand="0" w:evenVBand="0" w:oddHBand="1" w:evenHBand="0" w:firstRowFirstColumn="0" w:firstRowLastColumn="0" w:lastRowFirstColumn="0" w:lastRowLastColumn="0"/>
+        </w:trPr>
+        <w:tc>
+          <w:tcPr>
+            <w:cnfStyle w:val="001000000000" w:firstRow="0" w:lastRow="0" w:firstColumn="1" w:lastColumn="0" w:oddVBand="0" w:evenVBand="0" w:oddHBand="0" w:evenHBand="0" w:firstRowFirstColumn="0" w:firstRowLastColumn="0" w:lastRowFirstColumn="0" w:lastRowLastColumn="0"/>
+            <w:tcW w:w="4675" w:type="dxa"/>
+          </w:tcPr>
+          <w:p>
+            <w:r>
+              <w:t>Selected: depth 8, leaf minimum 5, half the features</w:t>
+            </w:r>
+          </w:p>
+        </w:tc>
+        <w:tc>
+          <w:tcPr>
+            <w:tcW w:w="2250" w:type="dxa"/>
+          </w:tcPr>
+          <w:p>
+            <w:pPr>
+              <w:cnfStyle w:val="000000100000" w:firstRow="0" w:lastRow="0" w:firstColumn="0" w:lastColumn="0" w:oddVBand="0" w:evenVBand="0" w:oddHBand="1" w:evenHBand="0" w:firstRowFirstColumn="0" w:firstRowLastColumn="0" w:lastRowFirstColumn="0" w:lastRowLastColumn="0"/>
+            </w:pPr>
+            <w:r>
+              <w:t>$9,258.59</w:t>
+            </w:r>
+          </w:p>
+        </w:tc>
+        <w:tc>
+          <w:tcPr>
+            <w:tcW w:w="2520" w:type="dxa"/>
+          </w:tcPr>
+          <w:p>
+            <w:pPr>
+              <w:cnfStyle w:val="000000100000" w:firstRow="0" w:lastRow="0" w:firstColumn="0" w:lastColumn="0" w:oddVBand="0" w:evenVBand="0" w:oddHBand="1" w:evenHBand="0" w:firstRowFirstColumn="0" w:firstRowLastColumn="0" w:lastRowFirstColumn="0" w:lastRowLastColumn="0"/>
+            </w:pPr>
+            <w:r>
+              <w:t>$9,559.79</w:t>
+            </w:r>
+          </w:p>
+        </w:tc>
+      </w:tr>
+      <w:tr>
+        <w:tc>
+          <w:tcPr>
+            <w:cnfStyle w:val="001000000000" w:firstRow="0" w:lastRow="0" w:firstColumn="1" w:lastColumn="0" w:oddVBand="0" w:evenVBand="0" w:oddHBand="0" w:evenHBand="0" w:firstRowFirstColumn="0" w:firstRowLastColumn="0" w:lastRowFirstColumn="0" w:lastRowLastColumn="0"/>
+            <w:tcW w:w="4675" w:type="dxa"/>
+          </w:tcPr>
+          <w:p>
+            <w:r>
+              <w:lastRenderedPageBreak/>
+              <w:t>Depth 8, leaf minimum 5, all features</w:t>
+            </w:r>
+          </w:p>
+        </w:tc>
+        <w:tc>
+          <w:tcPr>
+            <w:tcW w:w="2250" w:type="dxa"/>
+          </w:tcPr>
+          <w:p>
+            <w:pPr>
+              <w:cnfStyle w:val="000000000000" w:firstRow="0" w:lastRow="0" w:firstColumn="0" w:lastColumn="0" w:oddVBand="0" w:evenVBand="0" w:oddHBand="0" w:evenHBand="0" w:firstRowFirstColumn="0" w:firstRowLastColumn="0" w:lastRowFirstColumn="0" w:lastRowLastColumn="0"/>
+            </w:pPr>
+            <w:r>
+              <w:t>$9,215.73</w:t>
+            </w:r>
+            <w:r>
+              <w:tab/>
+            </w:r>
+          </w:p>
+        </w:tc>
+        <w:tc>
+          <w:tcPr>
+            <w:tcW w:w="2520" w:type="dxa"/>
+          </w:tcPr>
+          <w:p>
+            <w:pPr>
+              <w:cnfStyle w:val="000000000000" w:firstRow="0" w:lastRow="0" w:firstColumn="0" w:lastColumn="0" w:oddVBand="0" w:evenVBand="0" w:oddHBand="0" w:evenHBand="0" w:firstRowFirstColumn="0" w:firstRowLastColumn="0" w:lastRowFirstColumn="0" w:lastRowLastColumn="0"/>
+            </w:pPr>
+            <w:r>
+              <w:t>$9,581.74</w:t>
+            </w:r>
+          </w:p>
+        </w:tc>
+      </w:tr>
+      <w:tr>
+        <w:trPr>
+          <w:cnfStyle w:val="000000100000" w:firstRow="0" w:lastRow="0" w:firstColumn="0" w:lastColumn="0" w:oddVBand="0" w:evenVBand="0" w:oddHBand="1" w:evenHBand="0" w:firstRowFirstColumn="0" w:firstRowLastColumn="0" w:lastRowFirstColumn="0" w:lastRowLastColumn="0"/>
+        </w:trPr>
+        <w:tc>
+          <w:tcPr>
+            <w:cnfStyle w:val="001000000000" w:firstRow="0" w:lastRow="0" w:firstColumn="1" w:lastColumn="0" w:oddVBand="0" w:evenVBand="0" w:oddHBand="0" w:evenHBand="0" w:firstRowFirstColumn="0" w:firstRowLastColumn="0" w:lastRowFirstColumn="0" w:lastRowLastColumn="0"/>
+            <w:tcW w:w="4675" w:type="dxa"/>
+          </w:tcPr>
+          <w:p>
+            <w:r>
+              <w:t>No depth limit, leaf minimum 1, half the features</w:t>
+            </w:r>
+          </w:p>
+        </w:tc>
+        <w:tc>
+          <w:tcPr>
+            <w:tcW w:w="2250" w:type="dxa"/>
+          </w:tcPr>
+          <w:p>
+            <w:pPr>
+              <w:cnfStyle w:val="000000100000" w:firstRow="0" w:lastRow="0" w:firstColumn="0" w:lastColumn="0" w:oddVBand="0" w:evenVBand="0" w:oddHBand="1" w:evenHBand="0" w:firstRowFirstColumn="0" w:firstRowLastColumn="0" w:lastRowFirstColumn="0" w:lastRowLastColumn="0"/>
+            </w:pPr>
+            <w:r>
+              <w:t>$8,097.97</w:t>
+            </w:r>
+            <w:r>
+              <w:tab/>
+            </w:r>
+          </w:p>
+        </w:tc>
+        <w:tc>
+          <w:tcPr>
+            <w:tcW w:w="2520" w:type="dxa"/>
+          </w:tcPr>
+          <w:p>
+            <w:pPr>
+              <w:cnfStyle w:val="000000100000" w:firstRow="0" w:lastRow="0" w:firstColumn="0" w:lastColumn="0" w:oddVBand="0" w:evenVBand="0" w:oddHBand="1" w:evenHBand="0" w:firstRowFirstColumn="0" w:firstRowLastColumn="0" w:lastRowFirstColumn="0" w:lastRowLastColumn="0"/>
+            </w:pPr>
+            <w:r>
+              <w:t>$10,087.26</w:t>
+            </w:r>
+          </w:p>
+        </w:tc>
+      </w:tr>
+      <w:tr>
+        <w:tc>
+          <w:tcPr>
+            <w:cnfStyle w:val="001000000000" w:firstRow="0" w:lastRow="0" w:firstColumn="1" w:lastColumn="0" w:oddVBand="0" w:evenVBand="0" w:oddHBand="0" w:evenHBand="0" w:firstRowFirstColumn="0" w:firstRowLastColumn="0" w:lastRowFirstColumn="0" w:lastRowLastColumn="0"/>
+            <w:tcW w:w="4675" w:type="dxa"/>
+          </w:tcPr>
+          <w:p>
+            <w:r>
+              <w:t>No depth limit, leaf minimum 1, all features</w:t>
+            </w:r>
+          </w:p>
+        </w:tc>
+        <w:tc>
+          <w:tcPr>
+            <w:tcW w:w="2250" w:type="dxa"/>
+          </w:tcPr>
+          <w:p>
+            <w:pPr>
+              <w:cnfStyle w:val="000000000000" w:firstRow="0" w:lastRow="0" w:firstColumn="0" w:lastColumn="0" w:oddVBand="0" w:evenVBand="0" w:oddHBand="0" w:evenHBand="0" w:firstRowFirstColumn="0" w:firstRowLastColumn="0" w:lastRowFirstColumn="0" w:lastRowLastColumn="0"/>
+            </w:pPr>
+            <w:r>
+              <w:t>$8,102.55</w:t>
+            </w:r>
+            <w:r>
+              <w:tab/>
+            </w:r>
+          </w:p>
+        </w:tc>
+        <w:tc>
+          <w:tcPr>
+            <w:tcW w:w="2520" w:type="dxa"/>
+          </w:tcPr>
+          <w:p>
+            <w:pPr>
+              <w:cnfStyle w:val="000000000000" w:firstRow="0" w:lastRow="0" w:firstColumn="0" w:lastColumn="0" w:oddVBand="0" w:evenVBand="0" w:oddHBand="0" w:evenHBand="0" w:firstRowFirstColumn="0" w:firstRowLastColumn="0" w:lastRowFirstColumn="0" w:lastRowLastColumn="0"/>
+            </w:pPr>
+            <w:r>
+              <w:t>$10,099.54</w:t>
+            </w:r>
+          </w:p>
+        </w:tc>
+      </w:tr>
+    </w:tbl>
+    <w:p>
+      <w:r>
+        <w:t>This comparison illustrates why selection relied on validation error rather than training error. The selected configuration was best among the eight tested combinations; the limited search does not establish that it is the best possible Random Forest configuration. All tuning scores reported here remain provisional pending correction of the salary targets.</w:t>
       </w:r>
     </w:p>
     <w:p>
@@ -1343,7 +1822,6 @@
           <w:b/>
           <w:bCs/>
         </w:rPr>
-        <w:lastRenderedPageBreak/>
         <w:t>Model Comparison</w:t>
       </w:r>
     </w:p>
@@ -1611,7 +2089,15 @@
     </w:p>
     <w:p>
       <w:r>
-        <w:t>Overall, the Random Forest provided the best results.</w:t>
+        <w:t xml:space="preserve">Overall, </w:t>
+      </w:r>
+      <w:proofErr w:type="gramStart"/>
+      <w:r>
+        <w:t>the Random</w:t>
+      </w:r>
+      <w:proofErr w:type="gramEnd"/>
+      <w:r>
+        <w:t xml:space="preserve"> Forest provided the best results.</w:t>
       </w:r>
     </w:p>
     <w:p>
@@ -1624,17 +2110,34 @@
     </w:p>
     <w:p>
       <w:r>
-        <w:t>The first priority is to correct currency conversion, validate country labels against locations, and regenerate all downstream salary results. The report's salary figures, model comparison table, and conclusions about model performance should then be updated together.</w:t>
-      </w:r>
-    </w:p>
-    <w:p>
-      <w:r>
+        <w:t xml:space="preserve">The </w:t>
+      </w:r>
+      <w:proofErr w:type="gramStart"/>
+      <w:r>
+        <w:t>first priority</w:t>
+      </w:r>
+      <w:proofErr w:type="gramEnd"/>
+      <w:r>
+        <w:t xml:space="preserve"> is to correct currency conversion, validate country labels against locations, and regenerate all downstream salary results. The report's salary figures, model comparison table, and conclusions about model performance should then be updated together.</w:t>
+      </w:r>
+    </w:p>
+    <w:p>
+      <w:r>
+        <w:lastRenderedPageBreak/>
         <w:t>The predictive feature set omitted country, location, industry, work arrangement, title, and specialization. After data correction, testing these variables could establish whether they add information beyond experience. An experience-only model would also help quantify the incremental value of education and skills. Permutation importance and errors broken down by country, experience level, and specialization would provide a more complete assessment than aggregate metrics alone.</w:t>
       </w:r>
     </w:p>
     <w:p>
       <w:r>
-        <w:t>Finally, random splitting does not directly test performance on future postings or unfamiliar employers. A temporal split or employer-grouped evaluation would address those questions. Because the existing test results have already informed model comparison, further development should use a fresh final holdout or a nested evaluation design.</w:t>
+        <w:t xml:space="preserve">Finally, random splitting does not directly test performance on future postings or unfamiliar employers. A </w:t>
+      </w:r>
+      <w:proofErr w:type="gramStart"/>
+      <w:r>
+        <w:t>temporal split</w:t>
+      </w:r>
+      <w:proofErr w:type="gramEnd"/>
+      <w:r>
+        <w:t xml:space="preserve"> or employer-grouped evaluation would address those questions. Because the existing test results have already informed model comparison, further development should use a fresh final holdout or a nested evaluation design.</w:t>
       </w:r>
     </w:p>
     <w:p>
@@ -1642,7 +2145,6 @@
         <w:pStyle w:val="Heading2"/>
       </w:pPr>
       <w:r>
-        <w:lastRenderedPageBreak/>
         <w:t>Conclusion</w:t>
       </w:r>
     </w:p>
@@ -3402,6 +3904,236 @@
       </w:tcPr>
     </w:tblStylePr>
   </w:style>
+  <w:style w:type="table" w:styleId="GridTable5Dark">
+    <w:name w:val="Grid Table 5 Dark"/>
+    <w:basedOn w:val="TableNormal"/>
+    <w:uiPriority w:val="50"/>
+    <w:rsid w:val="007C4630"/>
+    <w:pPr>
+      <w:spacing w:after="0" w:line="240" w:lineRule="auto"/>
+    </w:pPr>
+    <w:tblPr>
+      <w:tblStyleRowBandSize w:val="1"/>
+      <w:tblStyleColBandSize w:val="1"/>
+      <w:tblBorders>
+        <w:top w:val="single" w:sz="4" w:space="0" w:color="FFFFFF" w:themeColor="background1"/>
+        <w:left w:val="single" w:sz="4" w:space="0" w:color="FFFFFF" w:themeColor="background1"/>
+        <w:bottom w:val="single" w:sz="4" w:space="0" w:color="FFFFFF" w:themeColor="background1"/>
+        <w:right w:val="single" w:sz="4" w:space="0" w:color="FFFFFF" w:themeColor="background1"/>
+        <w:insideH w:val="single" w:sz="4" w:space="0" w:color="FFFFFF" w:themeColor="background1"/>
+        <w:insideV w:val="single" w:sz="4" w:space="0" w:color="FFFFFF" w:themeColor="background1"/>
+      </w:tblBorders>
+    </w:tblPr>
+    <w:tcPr>
+      <w:shd w:val="clear" w:color="auto" w:fill="CCCCCC" w:themeFill="text1" w:themeFillTint="33"/>
+    </w:tcPr>
+    <w:tblStylePr w:type="firstRow">
+      <w:rPr>
+        <w:b/>
+        <w:bCs/>
+        <w:color w:val="FFFFFF" w:themeColor="background1"/>
+      </w:rPr>
+      <w:tblPr/>
+      <w:tcPr>
+        <w:tcBorders>
+          <w:top w:val="single" w:sz="4" w:space="0" w:color="FFFFFF" w:themeColor="background1"/>
+          <w:left w:val="single" w:sz="4" w:space="0" w:color="FFFFFF" w:themeColor="background1"/>
+          <w:right w:val="single" w:sz="4" w:space="0" w:color="FFFFFF" w:themeColor="background1"/>
+          <w:insideH w:val="nil"/>
+          <w:insideV w:val="nil"/>
+        </w:tcBorders>
+        <w:shd w:val="clear" w:color="auto" w:fill="000000" w:themeFill="text1"/>
+      </w:tcPr>
+    </w:tblStylePr>
+    <w:tblStylePr w:type="lastRow">
+      <w:rPr>
+        <w:b/>
+        <w:bCs/>
+        <w:color w:val="FFFFFF" w:themeColor="background1"/>
+      </w:rPr>
+      <w:tblPr/>
+      <w:tcPr>
+        <w:tcBorders>
+          <w:left w:val="single" w:sz="4" w:space="0" w:color="FFFFFF" w:themeColor="background1"/>
+          <w:bottom w:val="single" w:sz="4" w:space="0" w:color="FFFFFF" w:themeColor="background1"/>
+          <w:right w:val="single" w:sz="4" w:space="0" w:color="FFFFFF" w:themeColor="background1"/>
+          <w:insideH w:val="nil"/>
+          <w:insideV w:val="nil"/>
+        </w:tcBorders>
+        <w:shd w:val="clear" w:color="auto" w:fill="000000" w:themeFill="text1"/>
+      </w:tcPr>
+    </w:tblStylePr>
+    <w:tblStylePr w:type="firstCol">
+      <w:rPr>
+        <w:b/>
+        <w:bCs/>
+        <w:color w:val="FFFFFF" w:themeColor="background1"/>
+      </w:rPr>
+      <w:tblPr/>
+      <w:tcPr>
+        <w:tcBorders>
+          <w:top w:val="single" w:sz="4" w:space="0" w:color="FFFFFF" w:themeColor="background1"/>
+          <w:left w:val="single" w:sz="4" w:space="0" w:color="FFFFFF" w:themeColor="background1"/>
+          <w:bottom w:val="single" w:sz="4" w:space="0" w:color="FFFFFF" w:themeColor="background1"/>
+          <w:insideV w:val="nil"/>
+        </w:tcBorders>
+        <w:shd w:val="clear" w:color="auto" w:fill="000000" w:themeFill="text1"/>
+      </w:tcPr>
+    </w:tblStylePr>
+    <w:tblStylePr w:type="lastCol">
+      <w:rPr>
+        <w:b/>
+        <w:bCs/>
+        <w:color w:val="FFFFFF" w:themeColor="background1"/>
+      </w:rPr>
+      <w:tblPr/>
+      <w:tcPr>
+        <w:tcBorders>
+          <w:top w:val="single" w:sz="4" w:space="0" w:color="FFFFFF" w:themeColor="background1"/>
+          <w:bottom w:val="single" w:sz="4" w:space="0" w:color="FFFFFF" w:themeColor="background1"/>
+          <w:right w:val="single" w:sz="4" w:space="0" w:color="FFFFFF" w:themeColor="background1"/>
+          <w:insideV w:val="nil"/>
+        </w:tcBorders>
+        <w:shd w:val="clear" w:color="auto" w:fill="000000" w:themeFill="text1"/>
+      </w:tcPr>
+    </w:tblStylePr>
+    <w:tblStylePr w:type="band1Vert">
+      <w:tblPr/>
+      <w:tcPr>
+        <w:shd w:val="clear" w:color="auto" w:fill="999999" w:themeFill="text1" w:themeFillTint="66"/>
+      </w:tcPr>
+    </w:tblStylePr>
+    <w:tblStylePr w:type="band1Horz">
+      <w:tblPr/>
+      <w:tcPr>
+        <w:shd w:val="clear" w:color="auto" w:fill="999999" w:themeFill="text1" w:themeFillTint="66"/>
+      </w:tcPr>
+    </w:tblStylePr>
+  </w:style>
+  <w:style w:type="table" w:styleId="ListTable3">
+    <w:name w:val="List Table 3"/>
+    <w:basedOn w:val="TableNormal"/>
+    <w:uiPriority w:val="48"/>
+    <w:rsid w:val="007C4630"/>
+    <w:pPr>
+      <w:spacing w:after="0" w:line="240" w:lineRule="auto"/>
+    </w:pPr>
+    <w:tblPr>
+      <w:tblStyleRowBandSize w:val="1"/>
+      <w:tblStyleColBandSize w:val="1"/>
+      <w:tblBorders>
+        <w:top w:val="single" w:sz="4" w:space="0" w:color="000000" w:themeColor="text1"/>
+        <w:left w:val="single" w:sz="4" w:space="0" w:color="000000" w:themeColor="text1"/>
+        <w:bottom w:val="single" w:sz="4" w:space="0" w:color="000000" w:themeColor="text1"/>
+        <w:right w:val="single" w:sz="4" w:space="0" w:color="000000" w:themeColor="text1"/>
+      </w:tblBorders>
+    </w:tblPr>
+    <w:tblStylePr w:type="firstRow">
+      <w:rPr>
+        <w:b/>
+        <w:bCs/>
+        <w:color w:val="FFFFFF" w:themeColor="background1"/>
+      </w:rPr>
+      <w:tblPr/>
+      <w:tcPr>
+        <w:shd w:val="clear" w:color="auto" w:fill="000000" w:themeFill="text1"/>
+      </w:tcPr>
+    </w:tblStylePr>
+    <w:tblStylePr w:type="lastRow">
+      <w:rPr>
+        <w:b/>
+        <w:bCs/>
+      </w:rPr>
+      <w:tblPr/>
+      <w:tcPr>
+        <w:tcBorders>
+          <w:top w:val="double" w:sz="4" w:space="0" w:color="000000" w:themeColor="text1"/>
+        </w:tcBorders>
+        <w:shd w:val="clear" w:color="auto" w:fill="FFFFFF" w:themeFill="background1"/>
+      </w:tcPr>
+    </w:tblStylePr>
+    <w:tblStylePr w:type="firstCol">
+      <w:rPr>
+        <w:b/>
+        <w:bCs/>
+      </w:rPr>
+      <w:tblPr/>
+      <w:tcPr>
+        <w:tcBorders>
+          <w:right w:val="nil"/>
+        </w:tcBorders>
+        <w:shd w:val="clear" w:color="auto" w:fill="FFFFFF" w:themeFill="background1"/>
+      </w:tcPr>
+    </w:tblStylePr>
+    <w:tblStylePr w:type="lastCol">
+      <w:rPr>
+        <w:b/>
+        <w:bCs/>
+      </w:rPr>
+      <w:tblPr/>
+      <w:tcPr>
+        <w:tcBorders>
+          <w:left w:val="nil"/>
+        </w:tcBorders>
+        <w:shd w:val="clear" w:color="auto" w:fill="FFFFFF" w:themeFill="background1"/>
+      </w:tcPr>
+    </w:tblStylePr>
+    <w:tblStylePr w:type="band1Vert">
+      <w:tblPr/>
+      <w:tcPr>
+        <w:tcBorders>
+          <w:left w:val="single" w:sz="4" w:space="0" w:color="000000" w:themeColor="text1"/>
+          <w:right w:val="single" w:sz="4" w:space="0" w:color="000000" w:themeColor="text1"/>
+        </w:tcBorders>
+      </w:tcPr>
+    </w:tblStylePr>
+    <w:tblStylePr w:type="band1Horz">
+      <w:tblPr/>
+      <w:tcPr>
+        <w:tcBorders>
+          <w:top w:val="single" w:sz="4" w:space="0" w:color="000000" w:themeColor="text1"/>
+          <w:bottom w:val="single" w:sz="4" w:space="0" w:color="000000" w:themeColor="text1"/>
+          <w:insideH w:val="nil"/>
+        </w:tcBorders>
+      </w:tcPr>
+    </w:tblStylePr>
+    <w:tblStylePr w:type="neCell">
+      <w:tblPr/>
+      <w:tcPr>
+        <w:tcBorders>
+          <w:left w:val="nil"/>
+          <w:bottom w:val="nil"/>
+        </w:tcBorders>
+      </w:tcPr>
+    </w:tblStylePr>
+    <w:tblStylePr w:type="nwCell">
+      <w:tblPr/>
+      <w:tcPr>
+        <w:tcBorders>
+          <w:bottom w:val="nil"/>
+          <w:right w:val="nil"/>
+        </w:tcBorders>
+      </w:tcPr>
+    </w:tblStylePr>
+    <w:tblStylePr w:type="seCell">
+      <w:tblPr/>
+      <w:tcPr>
+        <w:tcBorders>
+          <w:top w:val="double" w:sz="4" w:space="0" w:color="000000" w:themeColor="text1"/>
+          <w:left w:val="nil"/>
+        </w:tcBorders>
+      </w:tcPr>
+    </w:tblStylePr>
+    <w:tblStylePr w:type="swCell">
+      <w:tblPr/>
+      <w:tcPr>
+        <w:tcBorders>
+          <w:top w:val="double" w:sz="4" w:space="0" w:color="000000" w:themeColor="text1"/>
+          <w:right w:val="nil"/>
+        </w:tcBorders>
+      </w:tcPr>
+    </w:tblStylePr>
+  </w:style>
 </w:styles>
 </file>
 

</xml_diff>